<commit_message>
docs: actualiza README e informe con el despliegue ya en produccion
- URL del sitio desplegado en GitHub Pages
- Nueva estructura del CD: compuerta de aprobacion y dos destinos
- Cifras al dia: 23 pruebas y cobertura vigente
- Configuracion aplicada en GitHub separada de la opcional pendiente
</commit_message>
<xml_diff>
--- a/docs/Informe Extraclase 2 - CICD - Andrew Corea Flores.docx
+++ b/docs/Informe Extraclase 2 - CICD - Andrew Corea Flores.docx
@@ -1038,7 +1038,7 @@
                 <w:sz w:val="20"/>
                 <w:szCs w:val="20"/>
               </w:rPr>
-              <w:t xml:space="preserve">lint, test, build, notify, build-image y deploy.</w:t>
+              <w:t xml:space="preserve">lint, test, build, notify, build-image, aprobar-produccion, deploy-pages y deploy-render.</w:t>
             </w:r>
           </w:p>
         </w:tc>
@@ -1519,7 +1519,26 @@
           <w:sz w:val="24"/>
           <w:szCs w:val="24"/>
         </w:rPr>
-        <w:t xml:space="preserve">Un workflow comprometido puede filtrar secretos, alterar artefactos de producción o inyectar código malicioso. Por ello el proyecto aplica el principio de mínimo privilegio declarando explícitamente la clave permissions en cada workflow, restringe la escritura de paquetes al único job que la necesita, almacena toda credencial en GitHub Secrets, y ejecuta el contenedor de producción con un usuario sin privilegios. La documentación oficial recomienda además fijar las acciones por SHA de commit en lugar de etiquetas mutables para mitigar ataques de cadena de suministro (GitHub, s.f.-b), práctica que se documenta en el repositorio como mejora pendiente para un entorno productivo real.</w:t>
+        <w:t xml:space="preserve">Un workflow comprometido puede filtrar secretos, alterar artefactos de producción o inyectar código malicioso. Por ello el proyecto aplica el principio de mínimo privilegio declarando explícitamente la clave permissions en cada workflow y restringiendo cada permiso elevado al único job que lo necesita: la escritura de paquetes solo en el job que publica la imagen, y la escritura de Pages solo en el job que despliega. Toda credencial se almacena en GitHub Secrets y el contenedor se ejecuta con un usuario sin privilegios.</w:t>
+      </w:r>
+    </w:p>
+    <w:p>
+      <w:pPr>
+        <w:spacing w:after="0" w:before="0" w:line="480"/>
+        <w:ind w:firstLine="720"/>
+        <w:jc w:val="both"/>
+      </w:pPr>
+      <w:r>
+        <w:rPr>
+          <w:rFonts w:ascii="Times New Roman" w:cs="Times New Roman" w:eastAsia="Times New Roman" w:hAnsi="Times New Roman"/>
+          <w:b w:val="false"/>
+          <w:bCs w:val="false"/>
+          <w:i w:val="false"/>
+          <w:iCs w:val="false"/>
+          <w:sz w:val="24"/>
+          <w:szCs w:val="24"/>
+        </w:rPr>
+        <w:t xml:space="preserve">La rama main está protegida con reglas que exigen la aprobación de los tres status checks de la integración continua antes de aceptar cambios, y que prohíben el forzado y el borrado de la rama. Las acciones se fijaron a sus versiones mayores vigentes, lo que además elimina las advertencias de deprecación del entorno de ejecución. La documentación oficial recomienda ir un paso más allá y fijarlas por SHA de commit en lugar de etiquetas mutables, para mitigar ataques de cadena de suministro (GitHub, s.f.-b); esa práctica se documenta en el repositorio como mejora pendiente para un entorno productivo real.</w:t>
       </w:r>
     </w:p>
     <w:p>
@@ -2335,7 +2354,7 @@
           <w:sz w:val="17"/>
           <w:szCs w:val="17"/>
         </w:rPr>
-        <w:t xml:space="preserve">  app.test.js            #  8 pruebas de integración</w:t>
+        <w:t xml:space="preserve">  app.test.js            #  9 pruebas de integración</w:t>
       </w:r>
     </w:p>
     <w:p>
@@ -2803,7 +2822,7 @@
                 <w:sz w:val="20"/>
                 <w:szCs w:val="20"/>
               </w:rPr>
-              <w:t xml:space="preserve">Job test con 22 pruebas ejecutadas por Jest, frente al mínimo de 5 solicitado.</w:t>
+              <w:t xml:space="preserve">Job test con 23 pruebas ejecutadas por Jest, frente al mínimo de 5 solicitado.</w:t>
             </w:r>
           </w:p>
         </w:tc>
@@ -2859,7 +2878,7 @@
                 <w:sz w:val="20"/>
                 <w:szCs w:val="20"/>
               </w:rPr>
-              <w:t xml:space="preserve">actions/upload-artifact@v4 publica el directorio coverage/ con retención de 14 días.</w:t>
+              <w:t xml:space="preserve">actions/upload-artifact@v7 publica el directorio coverage/ con retención de 14 días.</w:t>
             </w:r>
           </w:p>
         </w:tc>
@@ -3483,27 +3502,27 @@
           <w:sz w:val="17"/>
           <w:szCs w:val="17"/>
         </w:rPr>
-        <w:t xml:space="preserve">      - uses: actions/checkout@v4</w:t>
-      </w:r>
-    </w:p>
-    <w:p>
-      <w:pPr>
-        <w:pBdr>
-          <w:left w:val="single" w:color="BFBFBF" w:sz="4" w:space="4"/>
-          <w:right w:val="single" w:color="BFBFBF" w:sz="4" w:space="4"/>
-        </w:pBdr>
-        <w:shd w:fill="F2F2F2" w:color="auto" w:val="clear"/>
-        <w:spacing w:after="0" w:before="0" w:line="240"/>
-        <w:ind w:left="288" w:right="288"/>
-        <w:jc w:val="left"/>
-      </w:pPr>
-      <w:r>
-        <w:rPr>
-          <w:rFonts w:ascii="Courier New" w:cs="Courier New" w:eastAsia="Courier New" w:hAnsi="Courier New"/>
-          <w:sz w:val="17"/>
-          <w:szCs w:val="17"/>
-        </w:rPr>
-        <w:t xml:space="preserve">      - uses: actions/setup-node@v4</w:t>
+        <w:t xml:space="preserve">      - uses: actions/checkout@v7</w:t>
+      </w:r>
+    </w:p>
+    <w:p>
+      <w:pPr>
+        <w:pBdr>
+          <w:left w:val="single" w:color="BFBFBF" w:sz="4" w:space="4"/>
+          <w:right w:val="single" w:color="BFBFBF" w:sz="4" w:space="4"/>
+        </w:pBdr>
+        <w:shd w:fill="F2F2F2" w:color="auto" w:val="clear"/>
+        <w:spacing w:after="0" w:before="0" w:line="240"/>
+        <w:ind w:left="288" w:right="288"/>
+        <w:jc w:val="left"/>
+      </w:pPr>
+      <w:r>
+        <w:rPr>
+          <w:rFonts w:ascii="Courier New" w:cs="Courier New" w:eastAsia="Courier New" w:hAnsi="Courier New"/>
+          <w:sz w:val="17"/>
+          <w:szCs w:val="17"/>
+        </w:rPr>
+        <w:t xml:space="preserve">      - uses: actions/setup-node@v7</w:t>
       </w:r>
     </w:p>
     <w:p>
@@ -3675,7 +3694,7 @@
           <w:sz w:val="24"/>
           <w:szCs w:val="24"/>
         </w:rPr>
-        <w:t xml:space="preserve">La suite consta de 22 pruebas distribuidas en dos archivos. Las pruebas unitarias verifican las fronteras de la escala de calificación, el redondeo a dos decimales sin arrastre de error de punto flotante, la validación del rango permitido y el rechazo de rubros cuyos pesos no suman cien. Las pruebas de integración ejercitan cada endpoint, incluidos los casos de error que deben responder con código 400 y la ruta inexistente que debe responder 404.</w:t>
+        <w:t xml:space="preserve">La suite consta de 23 pruebas distribuidas en dos archivos. Las pruebas unitarias verifican las fronteras de la escala de calificación, el redondeo a dos decimales sin arrastre de error de punto flotante, la validación del rango permitido y el rechazo de rubros cuyos pesos no suman cien. Las pruebas de integración ejercitan cada endpoint, incluidos los casos de error que deben responder con código 400 y la ruta inexistente que debe responder 404.</w:t>
       </w:r>
     </w:p>
     <w:p>
@@ -3839,7 +3858,7 @@
           <w:sz w:val="17"/>
           <w:szCs w:val="17"/>
         </w:rPr>
-        <w:t xml:space="preserve">All files         |     100 |    89.58 |     100 |     100 |</w:t>
+        <w:t xml:space="preserve">All files         |     100 |    87.03 |     100 |     100 |</w:t>
       </w:r>
     </w:p>
     <w:p>
@@ -3899,27 +3918,27 @@
           <w:sz w:val="17"/>
           <w:szCs w:val="17"/>
         </w:rPr>
-        <w:t xml:space="preserve"> src/lib          |     100 |      100 |     100 |     100 |</w:t>
-      </w:r>
-    </w:p>
-    <w:p>
-      <w:pPr>
-        <w:pBdr>
-          <w:left w:val="single" w:color="BFBFBF" w:sz="4" w:space="4"/>
-          <w:right w:val="single" w:color="BFBFBF" w:sz="4" w:space="4"/>
-        </w:pBdr>
-        <w:shd w:fill="F2F2F2" w:color="auto" w:val="clear"/>
-        <w:spacing w:after="0" w:before="0" w:line="240"/>
-        <w:ind w:left="288" w:right="288"/>
-        <w:jc w:val="left"/>
-      </w:pPr>
-      <w:r>
-        <w:rPr>
-          <w:rFonts w:ascii="Courier New" w:cs="Courier New" w:eastAsia="Courier New" w:hAnsi="Courier New"/>
-          <w:sz w:val="17"/>
-          <w:szCs w:val="17"/>
-        </w:rPr>
-        <w:t xml:space="preserve">  notas.js        |     100 |      100 |     100 |     100 |</w:t>
+        <w:t xml:space="preserve"> src/lib          |     100 |    95.23 |     100 |     100 |</w:t>
+      </w:r>
+    </w:p>
+    <w:p>
+      <w:pPr>
+        <w:pBdr>
+          <w:left w:val="single" w:color="BFBFBF" w:sz="4" w:space="4"/>
+          <w:right w:val="single" w:color="BFBFBF" w:sz="4" w:space="4"/>
+        </w:pBdr>
+        <w:shd w:fill="F2F2F2" w:color="auto" w:val="clear"/>
+        <w:spacing w:after="0" w:before="0" w:line="240"/>
+        <w:ind w:left="288" w:right="288"/>
+        <w:jc w:val="left"/>
+      </w:pPr>
+      <w:r>
+        <w:rPr>
+          <w:rFonts w:ascii="Courier New" w:cs="Courier New" w:eastAsia="Courier New" w:hAnsi="Courier New"/>
+          <w:sz w:val="17"/>
+          <w:szCs w:val="17"/>
+        </w:rPr>
+        <w:t xml:space="preserve">  notas.js        |     100 |    95.23 |     100 |     100 |</w:t>
       </w:r>
     </w:p>
     <w:p>
@@ -4040,7 +4059,7 @@
           <w:sz w:val="17"/>
           <w:szCs w:val="17"/>
         </w:rPr>
-        <w:t xml:space="preserve">Tests:       22 passed, 22 total</w:t>
+        <w:t xml:space="preserve">Tests:       23 passed, 23 total</w:t>
       </w:r>
     </w:p>
     <w:p>
@@ -4697,6 +4716,100 @@
           <w:szCs w:val="17"/>
         </w:rPr>
         <w:t xml:space="preserve">      github.event.workflow_run.conclusion == 'success'</w:t>
+      </w:r>
+    </w:p>
+    <w:p>
+      <w:pPr>
+        <w:spacing w:after="0" w:before="0" w:line="480"/>
+      </w:pPr>
+      <w:r>
+        <w:rPr>
+          <w:rFonts w:ascii="Times New Roman" w:cs="Times New Roman" w:eastAsia="Times New Roman" w:hAnsi="Times New Roman"/>
+          <w:sz w:val="24"/>
+          <w:szCs w:val="24"/>
+        </w:rPr>
+        <w:t xml:space="preserve"/>
+      </w:r>
+    </w:p>
+    <w:p>
+      <w:pPr>
+        <w:spacing w:after="0" w:before="0" w:line="480"/>
+        <w:ind w:firstLine="720"/>
+        <w:jc w:val="both"/>
+      </w:pPr>
+      <w:r>
+        <w:rPr>
+          <w:rFonts w:ascii="Times New Roman" w:cs="Times New Roman" w:eastAsia="Times New Roman" w:hAnsi="Times New Roman"/>
+          <w:b w:val="false"/>
+          <w:bCs w:val="false"/>
+          <w:i w:val="false"/>
+          <w:iCs w:val="false"/>
+          <w:sz w:val="24"/>
+          <w:szCs w:val="24"/>
+        </w:rPr>
+        <w:t xml:space="preserve">El pipeline se organiza en cinco jobs. El primero construye el artefacto; el segundo actúa como compuerta de aprobación sobre el environment protegido; el tercero y el cuarto ejecutan los dos destinos de despliegue; y el quinto deja constancia cuando la integración falló y no corresponde desplegar nada.</w:t>
+      </w:r>
+    </w:p>
+    <w:p>
+      <w:pPr>
+        <w:pBdr>
+          <w:top w:val="single" w:color="BFBFBF" w:sz="4" w:space="4"/>
+          <w:left w:val="single" w:color="BFBFBF" w:sz="4" w:space="4"/>
+          <w:right w:val="single" w:color="BFBFBF" w:sz="4" w:space="4"/>
+        </w:pBdr>
+        <w:shd w:fill="F2F2F2" w:color="auto" w:val="clear"/>
+        <w:spacing w:after="0" w:before="0" w:line="240"/>
+        <w:ind w:left="288" w:right="288"/>
+        <w:jc w:val="left"/>
+      </w:pPr>
+      <w:r>
+        <w:rPr>
+          <w:rFonts w:ascii="Courier New" w:cs="Courier New" w:eastAsia="Courier New" w:hAnsi="Courier New"/>
+          <w:sz w:val="17"/>
+          <w:szCs w:val="17"/>
+        </w:rPr>
+        <w:t xml:space="preserve">build-image  -&gt;  aprobar-produccion  -&gt;  deploy-pages</w:t>
+      </w:r>
+    </w:p>
+    <w:p>
+      <w:pPr>
+        <w:pBdr>
+          <w:left w:val="single" w:color="BFBFBF" w:sz="4" w:space="4"/>
+          <w:right w:val="single" w:color="BFBFBF" w:sz="4" w:space="4"/>
+        </w:pBdr>
+        <w:shd w:fill="F2F2F2" w:color="auto" w:val="clear"/>
+        <w:spacing w:after="0" w:before="0" w:line="240"/>
+        <w:ind w:left="288" w:right="288"/>
+        <w:jc w:val="left"/>
+      </w:pPr>
+      <w:r>
+        <w:rPr>
+          <w:rFonts w:ascii="Courier New" w:cs="Courier New" w:eastAsia="Courier New" w:hAnsi="Courier New"/>
+          <w:sz w:val="17"/>
+          <w:szCs w:val="17"/>
+        </w:rPr>
+        <w:t xml:space="preserve">                 (environment            deploy-render</w:t>
+      </w:r>
+    </w:p>
+    <w:p>
+      <w:pPr>
+        <w:pBdr>
+          <w:bottom w:val="single" w:color="BFBFBF" w:sz="4" w:space="4"/>
+          <w:left w:val="single" w:color="BFBFBF" w:sz="4" w:space="4"/>
+          <w:right w:val="single" w:color="BFBFBF" w:sz="4" w:space="4"/>
+        </w:pBdr>
+        <w:shd w:fill="F2F2F2" w:color="auto" w:val="clear"/>
+        <w:spacing w:after="0" w:before="0" w:line="240"/>
+        <w:ind w:left="288" w:right="288"/>
+        <w:jc w:val="left"/>
+      </w:pPr>
+      <w:r>
+        <w:rPr>
+          <w:rFonts w:ascii="Courier New" w:cs="Courier New" w:eastAsia="Courier New" w:hAnsi="Courier New"/>
+          <w:sz w:val="17"/>
+          <w:szCs w:val="17"/>
+        </w:rPr>
+        <w:t xml:space="preserve">                  protegido)</w:t>
       </w:r>
     </w:p>
     <w:p>
@@ -4854,7 +4967,26 @@
           <w:sz w:val="24"/>
           <w:szCs w:val="24"/>
         </w:rPr>
-        <w:t xml:space="preserve">El job de despliegue declara el environment production. Este entorno se configuró en el repositorio con una regla de protección de revisor requerido, por lo que el job queda en estado de espera hasta que se apruebe manualmente desde la interfaz de GitHub. Se trata, en la terminología del marco teórico, de una entrega continua: el artefacto está listo y verificado, pero la liberación final permanece bajo control humano.</w:t>
+        <w:t xml:space="preserve">El job aprobar-produccion declara el environment production, configurado en el repositorio con una regla de revisor requerido. El pipeline se detiene en ese punto y no ejecuta ningún despliegue hasta que se autoriza manualmente desde la interfaz de GitHub. Se trata, en la terminología del marco teórico, de una entrega continua: el artefacto está construido y verificado, pero la liberación final permanece bajo control humano.</w:t>
+      </w:r>
+    </w:p>
+    <w:p>
+      <w:pPr>
+        <w:spacing w:after="0" w:before="0" w:line="480"/>
+        <w:ind w:firstLine="720"/>
+        <w:jc w:val="both"/>
+      </w:pPr>
+      <w:r>
+        <w:rPr>
+          <w:rFonts w:ascii="Times New Roman" w:cs="Times New Roman" w:eastAsia="Times New Roman" w:hAnsi="Times New Roman"/>
+          <w:b w:val="false"/>
+          <w:bCs w:val="false"/>
+          <w:i w:val="false"/>
+          <w:iCs w:val="false"/>
+          <w:sz w:val="24"/>
+          <w:szCs w:val="24"/>
+        </w:rPr>
+        <w:t xml:space="preserve">Aislar la aprobación en un job propio permite que los dos destinos de despliegue dependan de una única autorización, en lugar de exigir una aprobación por cada destino. Además, deja registrado en el historial del entorno qué artefacto se autorizó y quién lo hizo.</w:t>
       </w:r>
     </w:p>
     <w:p>
@@ -4884,7 +5016,7 @@
           <w:sz w:val="24"/>
           <w:szCs w:val="24"/>
         </w:rPr>
-        <w:t xml:space="preserve">Secretos y variables configurados en el repositorio</w:t>
+        <w:t xml:space="preserve">Secretos y variables del pipeline de despliegue</w:t>
       </w:r>
     </w:p>
     <w:tbl>
@@ -5046,7 +5178,7 @@
                 <w:sz w:val="20"/>
                 <w:szCs w:val="20"/>
               </w:rPr>
-              <w:t xml:space="preserve">RENDER_DEPLOY_HOOK</w:t>
+              <w:t xml:space="preserve">GITHUB_TOKEN</w:t>
             </w:r>
           </w:p>
         </w:tc>
@@ -5073,7 +5205,7 @@
                 <w:sz w:val="20"/>
                 <w:szCs w:val="20"/>
               </w:rPr>
-              <w:t xml:space="preserve">Secret</w:t>
+              <w:t xml:space="preserve">Automático</w:t>
             </w:r>
           </w:p>
         </w:tc>
@@ -5100,7 +5232,7 @@
                 <w:sz w:val="20"/>
                 <w:szCs w:val="20"/>
               </w:rPr>
-              <w:t xml:space="preserve">Environment production</w:t>
+              <w:t xml:space="preserve">Workflow</w:t>
             </w:r>
           </w:p>
         </w:tc>
@@ -5127,7 +5259,7 @@
                 <w:sz w:val="20"/>
                 <w:szCs w:val="20"/>
               </w:rPr>
-              <w:t xml:space="preserve">URL del deploy hook que dispara la liberación en Render.</w:t>
+              <w:t xml:space="preserve">Autenticación contra ghcr.io mediante el permiso packages: write, y publicación en Pages mediante pages: write.</w:t>
             </w:r>
           </w:p>
         </w:tc>
@@ -5156,7 +5288,7 @@
                 <w:sz w:val="20"/>
                 <w:szCs w:val="20"/>
               </w:rPr>
-              <w:t xml:space="preserve">PRODUCTION_URL</w:t>
+              <w:t xml:space="preserve">RENDER_DEPLOY_HOOK</w:t>
             </w:r>
           </w:p>
         </w:tc>
@@ -5183,7 +5315,7 @@
                 <w:sz w:val="20"/>
                 <w:szCs w:val="20"/>
               </w:rPr>
-              <w:t xml:space="preserve">Variable</w:t>
+              <w:t xml:space="preserve">Secret</w:t>
             </w:r>
           </w:p>
         </w:tc>
@@ -5237,7 +5369,7 @@
                 <w:sz w:val="20"/>
                 <w:szCs w:val="20"/>
               </w:rPr>
-              <w:t xml:space="preserve">URL pública del servicio, empleada en el smoke test posterior al despliegue.</w:t>
+              <w:t xml:space="preserve">URL del deploy hook que dispara la liberación del contenedor en Render.</w:t>
             </w:r>
           </w:p>
         </w:tc>
@@ -5266,7 +5398,7 @@
                 <w:sz w:val="20"/>
                 <w:szCs w:val="20"/>
               </w:rPr>
-              <w:t xml:space="preserve">DISCORD_WEBHOOK</w:t>
+              <w:t xml:space="preserve">PRODUCTION_URL</w:t>
             </w:r>
           </w:p>
         </w:tc>
@@ -5293,7 +5425,7 @@
                 <w:sz w:val="20"/>
                 <w:szCs w:val="20"/>
               </w:rPr>
-              <w:t xml:space="preserve">Secret</w:t>
+              <w:t xml:space="preserve">Variable</w:t>
             </w:r>
           </w:p>
         </w:tc>
@@ -5320,7 +5452,7 @@
                 <w:sz w:val="20"/>
                 <w:szCs w:val="20"/>
               </w:rPr>
-              <w:t xml:space="preserve">Repositorio</w:t>
+              <w:t xml:space="preserve">Environment production</w:t>
             </w:r>
           </w:p>
         </w:tc>
@@ -5347,7 +5479,7 @@
                 <w:sz w:val="20"/>
                 <w:szCs w:val="20"/>
               </w:rPr>
-              <w:t xml:space="preserve">Notificaciones del pipeline de CI (opcional).</w:t>
+              <w:t xml:space="preserve">URL pública de la API, empleada en el smoke test posterior al despliegue.</w:t>
             </w:r>
           </w:p>
         </w:tc>
@@ -5376,7 +5508,7 @@
                 <w:sz w:val="20"/>
                 <w:szCs w:val="20"/>
               </w:rPr>
-              <w:t xml:space="preserve">GITHUB_TOKEN</w:t>
+              <w:t xml:space="preserve">DISCORD_WEBHOOK</w:t>
             </w:r>
           </w:p>
         </w:tc>
@@ -5403,7 +5535,7 @@
                 <w:sz w:val="20"/>
                 <w:szCs w:val="20"/>
               </w:rPr>
-              <w:t xml:space="preserve">Automático</w:t>
+              <w:t xml:space="preserve">Secret</w:t>
             </w:r>
           </w:p>
         </w:tc>
@@ -5430,7 +5562,7 @@
                 <w:sz w:val="20"/>
                 <w:szCs w:val="20"/>
               </w:rPr>
-              <w:t xml:space="preserve">Workflow</w:t>
+              <w:t xml:space="preserve">Repositorio</w:t>
             </w:r>
           </w:p>
         </w:tc>
@@ -5457,7 +5589,7 @@
                 <w:sz w:val="20"/>
                 <w:szCs w:val="20"/>
               </w:rPr>
-              <w:t xml:space="preserve">Autenticación contra ghcr.io mediante el permiso packages: write.</w:t>
+              <w:t xml:space="preserve">Notificaciones del pipeline de CI (opcional).</w:t>
             </w:r>
           </w:p>
         </w:tc>
@@ -5504,7 +5636,7 @@
           <w:sz w:val="24"/>
           <w:szCs w:val="24"/>
         </w:rPr>
-        <w:t xml:space="preserve">5.3. Verificación posterior al despliegue</w:t>
+        <w:t xml:space="preserve">5.3. Los dos destinos de despliegue</w:t>
       </w:r>
     </w:p>
     <w:p>
@@ -5523,7 +5655,7 @@
           <w:sz w:val="24"/>
           <w:szCs w:val="24"/>
         </w:rPr>
-        <w:t xml:space="preserve">Tras invocar el deploy hook, el workflow consulta de forma repetida el endpoint de salud durante un máximo de cinco minutos. Si el servicio no responde con un código satisfactorio en ese lapso, el job falla y el despliegue queda marcado como incorrecto en el historial del entorno. Esta verificación convierte al pipeline en algo más que un mecanismo de copia de archivos: comprueba que la versión liberada efectivamente atiende peticiones.</w:t>
+        <w:t xml:space="preserve">El job deploy-pages publica el bundle estático en GitHub Pages. Dado que Pages solo sirve archivos estáticos, la interfaz web detecta al cargar si el origen expone la API: cuando la encuentra delega los cálculos en el servidor, y cuando no la encuentra ejecuta en el navegador el mismo módulo de dominio que verifican las pruebas. El pipeline copia ese módulo desde src/lib al bundle, de modo que no existe una copia paralela del código que pudiera desincronizarse.</w:t>
       </w:r>
     </w:p>
     <w:p>
@@ -5542,7 +5674,7 @@
           <w:sz w:val="24"/>
           <w:szCs w:val="24"/>
         </w:rPr>
-        <w:t xml:space="preserve">Un tercer job, denominado ci-fallido, se activa cuando el workflow de integración concluyó con un estado distinto de éxito y deja constancia explícita en el resumen de que el despliegue se omitió, lo que facilita la auditoría posterior del historial de ejecuciones.</w:t>
+        <w:t xml:space="preserve">El job deploy-render libera la API completa en un contenedor. Cuando el secret correspondiente no está configurado, el job lo detecta, emite un aviso y omite los pasos de despliegue en lugar de fallar, de manera que un destino opcional no marca en rojo un pipeline cuyo despliegue principal sí se completó.</w:t>
       </w:r>
     </w:p>
     <w:p>
@@ -5562,14 +5694,84 @@
           <w:sz w:val="24"/>
           <w:szCs w:val="24"/>
         </w:rPr>
-        <w:t xml:space="preserve">5.4. Evidencias</w:t>
-      </w:r>
-    </w:p>
-    <w:p>
-      <w:pPr>
-        <w:spacing w:after="0" w:before="0" w:line="480"/>
+        <w:t xml:space="preserve">5.4. Verificación posterior al despliegue</w:t>
+      </w:r>
+    </w:p>
+    <w:p>
+      <w:pPr>
+        <w:spacing w:after="0" w:before="0" w:line="480"/>
+        <w:ind w:firstLine="720"/>
         <w:jc w:val="both"/>
       </w:pPr>
+      <w:r>
+        <w:rPr>
+          <w:rFonts w:ascii="Times New Roman" w:cs="Times New Roman" w:eastAsia="Times New Roman" w:hAnsi="Times New Roman"/>
+          <w:b w:val="false"/>
+          <w:bCs w:val="false"/>
+          <w:i w:val="false"/>
+          <w:iCs w:val="false"/>
+          <w:sz w:val="24"/>
+          <w:szCs w:val="24"/>
+        </w:rPr>
+        <w:t xml:space="preserve">Ambos destinos incluyen un smoke test. En el caso de Pages, el workflow consulta la URL publicada hasta veinte veces hasta obtener un código 200; en el caso de Render, consulta el endpoint de salud durante un máximo de cinco minutos. Si el servicio no responde en ese lapso, el job falla y el despliegue queda marcado como incorrecto en el historial del entorno. Esta verificación convierte al pipeline en algo más que un mecanismo de copia de archivos: comprueba que la versión liberada efectivamente atiende peticiones.</w:t>
+      </w:r>
+    </w:p>
+    <w:p>
+      <w:pPr>
+        <w:spacing w:after="0" w:before="0" w:line="480"/>
+        <w:ind w:firstLine="720"/>
+        <w:jc w:val="both"/>
+      </w:pPr>
+      <w:r>
+        <w:rPr>
+          <w:rFonts w:ascii="Times New Roman" w:cs="Times New Roman" w:eastAsia="Times New Roman" w:hAnsi="Times New Roman"/>
+          <w:b w:val="false"/>
+          <w:bCs w:val="false"/>
+          <w:i w:val="false"/>
+          <w:iCs w:val="false"/>
+          <w:sz w:val="24"/>
+          <w:szCs w:val="24"/>
+        </w:rPr>
+        <w:t xml:space="preserve">El job ci-fallido se activa cuando el workflow de integración concluyó con un estado distinto de éxito, y deja constancia explícita en el resumen de que el despliegue se omitió, lo que facilita la auditoría posterior del historial de ejecuciones.</w:t>
+      </w:r>
+    </w:p>
+    <w:p>
+      <w:pPr>
+        <w:pStyle w:val="Heading3"/>
+        <w:spacing w:after="0" w:before="120" w:line="480"/>
+        <w:jc w:val="left"/>
+      </w:pPr>
+      <w:r>
+        <w:rPr>
+          <w:rFonts w:ascii="Times New Roman" w:cs="Times New Roman" w:eastAsia="Times New Roman" w:hAnsi="Times New Roman"/>
+          <w:b/>
+          <w:bCs/>
+          <w:i/>
+          <w:iCs/>
+          <w:color w:val="000000"/>
+          <w:sz w:val="24"/>
+          <w:szCs w:val="24"/>
+        </w:rPr>
+        <w:t xml:space="preserve">5.5. Resultado obtenido</w:t>
+      </w:r>
+    </w:p>
+    <w:p>
+      <w:pPr>
+        <w:spacing w:after="0" w:before="0" w:line="480"/>
+        <w:jc w:val="both"/>
+      </w:pPr>
+      <w:r>
+        <w:rPr>
+          <w:rFonts w:ascii="Times New Roman" w:cs="Times New Roman" w:eastAsia="Times New Roman" w:hAnsi="Times New Roman"/>
+          <w:b w:val="false"/>
+          <w:bCs w:val="false"/>
+          <w:i w:val="false"/>
+          <w:iCs w:val="false"/>
+          <w:sz w:val="24"/>
+          <w:szCs w:val="24"/>
+        </w:rPr>
+        <w:t xml:space="preserve">URL del sitio desplegado: </w:t>
+      </w:r>
       <w:r>
         <w:rPr>
           <w:rFonts w:ascii="Times New Roman" w:cs="Times New Roman" w:eastAsia="Times New Roman" w:hAnsi="Times New Roman"/>
@@ -5580,7 +5782,26 @@
           <w:sz w:val="24"/>
           <w:szCs w:val="24"/>
         </w:rPr>
-        <w:t xml:space="preserve">URL del sitio desplegado: ______________________________________________</w:t>
+        <w:t xml:space="preserve">https://andrewflores-23.github.io/extraclase2-cicd/</w:t>
+      </w:r>
+    </w:p>
+    <w:p>
+      <w:pPr>
+        <w:spacing w:after="0" w:before="0" w:line="480"/>
+        <w:ind w:firstLine="720"/>
+        <w:jc w:val="both"/>
+      </w:pPr>
+      <w:r>
+        <w:rPr>
+          <w:rFonts w:ascii="Times New Roman" w:cs="Times New Roman" w:eastAsia="Times New Roman" w:hAnsi="Times New Roman"/>
+          <w:b w:val="false"/>
+          <w:bCs w:val="false"/>
+          <w:i w:val="false"/>
+          <w:iCs w:val="false"/>
+          <w:sz w:val="24"/>
+          <w:szCs w:val="24"/>
+        </w:rPr>
+        <w:t xml:space="preserve">La ejecución del pipeline sobre la rama main construyó y publicó la imagen en GitHub Container Registry, se detuvo en la compuerta de aprobación, y tras autorizarla desplegó el sitio, que respondió correctamente al smoke test. La página desplegada calcula el promedio del grupo de ejemplo y devuelve exactamente los mismos valores que la API: promedio de 72, letra C, condición de aprobado y tres estudiantes aprobados de cinco, equivalentes al 60 %.</w:t>
       </w:r>
     </w:p>
     <w:p>
@@ -5744,7 +5965,7 @@
           <w:sz w:val="24"/>
           <w:szCs w:val="24"/>
         </w:rPr>
-        <w:t xml:space="preserve">Despliegue en espera de aprobación y posterior liberación exitosa.</w:t>
+        <w:t xml:space="preserve">Despliegue retenido en la compuerta de aprobación y liberado tras autorizarlo.</w:t>
       </w:r>
     </w:p>
     <w:p>
@@ -5781,7 +6002,7 @@
           <w:szCs w:val="18"/>
         </w:rPr>
         <w:br/>
-        <w:t xml:space="preserve">Capturar el job deploy en estado Waiting y luego aprobado, con el enlace al entorno.</w:t>
+        <w:t xml:space="preserve">Capturar el job Aprobacion para produccion en estado Waiting, y luego el pipeline completo en verde.</w:t>
       </w:r>
     </w:p>
     <w:p>
@@ -5811,7 +6032,7 @@
           <w:sz w:val="24"/>
           <w:szCs w:val="24"/>
         </w:rPr>
-        <w:t xml:space="preserve">Sitio en producción respondiendo en el endpoint de salud.</w:t>
+        <w:t xml:space="preserve">Sitio desplegado en GitHub Pages calculando el resumen del grupo.</w:t>
       </w:r>
     </w:p>
     <w:p>
@@ -5848,7 +6069,7 @@
           <w:szCs w:val="18"/>
         </w:rPr>
         <w:br/>
-        <w:t xml:space="preserve">Capturar el navegador en la URL de producción y en /api/health.</w:t>
+        <w:t xml:space="preserve">Capturar el navegador en https://andrewflores-23.github.io/extraclase2-cicd/ tras pulsar Calcular resumen.</w:t>
       </w:r>
     </w:p>
     <w:p>
@@ -8205,7 +8426,7 @@
           <w:sz w:val="24"/>
           <w:szCs w:val="24"/>
         </w:rPr>
-        <w:t xml:space="preserve">La implementación permitió comprobar que el valor de un pipeline no reside en la cantidad de pasos automatizados, sino en las condiciones que impone antes de permitir el avance de un cambio. En el proyecto desarrollado, un commit debe superar el análisis estático, veintidós pruebas, umbrales mínimos de cobertura y una verificación real del contenedor antes de siquiera generar un artefacto desplegable; solo entonces interviene la aprobación humana.</w:t>
+        <w:t xml:space="preserve">La implementación permitió comprobar que el valor de un pipeline no reside en la cantidad de pasos automatizados, sino en las condiciones que impone antes de permitir el avance de un cambio. En el proyecto desarrollado, un commit debe superar el análisis estático, veintitrés pruebas, umbrales mínimos de cobertura y una verificación real del contenedor antes de siquiera generar un artefacto desplegable; solo entonces interviene la aprobación humana.</w:t>
       </w:r>
     </w:p>
     <w:p>
@@ -8779,7 +9000,7 @@
           <w:sz w:val="17"/>
           <w:szCs w:val="17"/>
         </w:rPr>
-        <w:t xml:space="preserve">npm test          # 22 pruebas con Jest</w:t>
+        <w:t xml:space="preserve">npm test          # 23 pruebas con Jest</w:t>
       </w:r>
     </w:p>
     <w:p>
@@ -8911,7 +9132,7 @@
           <w:sz w:val="24"/>
           <w:szCs w:val="24"/>
         </w:rPr>
-        <w:t xml:space="preserve">Configuración requerida en GitHub</w:t>
+        <w:t xml:space="preserve">Configuración aplicada en GitHub</w:t>
       </w:r>
     </w:p>
     <w:p>
@@ -8930,7 +9151,7 @@
           <w:sz w:val="24"/>
           <w:szCs w:val="24"/>
         </w:rPr>
-        <w:t xml:space="preserve">Crear el repositorio público y subir las ramas main y develop.</w:t>
+        <w:t xml:space="preserve">Repositorio público creado con las ramas main y develop.</w:t>
       </w:r>
     </w:p>
     <w:p>
@@ -8949,7 +9170,7 @@
           <w:sz w:val="24"/>
           <w:szCs w:val="24"/>
         </w:rPr>
-        <w:t xml:space="preserve">En Settings &gt; Environments, crear el environment production y activar la regla Required reviewers.</w:t>
+        <w:t xml:space="preserve">Environment production con la regla Required reviewers activa.</w:t>
       </w:r>
     </w:p>
     <w:p>
@@ -8968,7 +9189,7 @@
           <w:sz w:val="24"/>
           <w:szCs w:val="24"/>
         </w:rPr>
-        <w:t xml:space="preserve">Registrar el secret RENDER_DEPLOY_HOOK y la variable PRODUCTION_URL dentro de ese environment.</w:t>
+        <w:t xml:space="preserve">GitHub Pages habilitado con GitHub Actions como origen de la publicación.</w:t>
       </w:r>
     </w:p>
     <w:p>
@@ -8987,7 +9208,57 @@
           <w:sz w:val="24"/>
           <w:szCs w:val="24"/>
         </w:rPr>
-        <w:t xml:space="preserve">Opcionalmente, registrar el secret DISCORD_WEBHOOK a nivel de repositorio para las notificaciones.</w:t>
+        <w:t xml:space="preserve">Rama main protegida: se exigen los tres status checks de la integración continua y se prohíben el forzado y el borrado de la rama.</w:t>
+      </w:r>
+    </w:p>
+    <w:p>
+      <w:pPr>
+        <w:spacing w:after="0" w:before="0" w:line="480"/>
+      </w:pPr>
+      <w:r>
+        <w:rPr>
+          <w:rFonts w:ascii="Times New Roman" w:cs="Times New Roman" w:eastAsia="Times New Roman" w:hAnsi="Times New Roman"/>
+          <w:sz w:val="24"/>
+          <w:szCs w:val="24"/>
+        </w:rPr>
+        <w:t xml:space="preserve"/>
+      </w:r>
+    </w:p>
+    <w:p>
+      <w:pPr>
+        <w:pStyle w:val="Heading2"/>
+        <w:spacing w:after="0" w:before="120" w:line="480"/>
+        <w:jc w:val="left"/>
+      </w:pPr>
+      <w:r>
+        <w:rPr>
+          <w:rFonts w:ascii="Times New Roman" w:cs="Times New Roman" w:eastAsia="Times New Roman" w:hAnsi="Times New Roman"/>
+          <w:b/>
+          <w:bCs/>
+          <w:color w:val="000000"/>
+          <w:sz w:val="24"/>
+          <w:szCs w:val="24"/>
+        </w:rPr>
+        <w:t xml:space="preserve">Configuración opcional pendiente</w:t>
+      </w:r>
+    </w:p>
+    <w:p>
+      <w:pPr>
+        <w:spacing w:after="0" w:before="0" w:line="480"/>
+        <w:ind w:firstLine="720"/>
+        <w:jc w:val="both"/>
+      </w:pPr>
+      <w:r>
+        <w:rPr>
+          <w:rFonts w:ascii="Times New Roman" w:cs="Times New Roman" w:eastAsia="Times New Roman" w:hAnsi="Times New Roman"/>
+          <w:b w:val="false"/>
+          <w:bCs w:val="false"/>
+          <w:i w:val="false"/>
+          <w:iCs w:val="false"/>
+          <w:sz w:val="24"/>
+          <w:szCs w:val="24"/>
+        </w:rPr>
+        <w:t xml:space="preserve">Los dos elementos siguientes solo son necesarios para el destino de despliegue en contenedor y para las notificaciones externas. El pipeline funciona y despliega correctamente sin ellos.</w:t>
       </w:r>
     </w:p>
     <w:p>
@@ -9006,7 +9277,26 @@
           <w:sz w:val="24"/>
           <w:szCs w:val="24"/>
         </w:rPr>
-        <w:t xml:space="preserve">En Settings &gt; Branches, proteger la rama main exigiendo que los status checks de la integración continua pasen antes de fusionar.</w:t>
+        <w:t xml:space="preserve">Crear el servicio gratuito en Render a partir del Dockerfile del repositorio y registrar su deploy hook como el secret RENDER_DEPLOY_HOOK dentro del environment production, junto con la variable PRODUCTION_URL.</w:t>
+      </w:r>
+    </w:p>
+    <w:p>
+      <w:pPr>
+        <w:pStyle w:val="ListParagraph"/>
+        <w:numPr>
+          <w:ilvl w:val="0"/>
+          <w:numId w:val="2"/>
+        </w:numPr>
+        <w:spacing w:after="0" w:before="0" w:line="480"/>
+        <w:jc w:val="both"/>
+      </w:pPr>
+      <w:r>
+        <w:rPr>
+          <w:rFonts w:ascii="Times New Roman" w:cs="Times New Roman" w:eastAsia="Times New Roman" w:hAnsi="Times New Roman"/>
+          <w:sz w:val="24"/>
+          <w:szCs w:val="24"/>
+        </w:rPr>
+        <w:t xml:space="preserve">Registrar el secret DISCORD_WEBHOOK a nivel de repositorio para recibir las notificaciones del pipeline en un canal.</w:t>
       </w:r>
     </w:p>
     <w:sectPr>

</xml_diff>